<commit_message>
Formatos Word: logo de BBOSCH en lugar del de STN y texto STN a Bbosch
Se corrigieron 58 formatos .docx (copias fuera del repositorio): logo de STN grupo
saesa reemplazado por el de BBOSCH en 37 y «STN» a «Bbosch» en firmantes y código de
norma. En el repositorio se actualiza INSP-05, el demo y ARBOL_INSPECCIONES.md.
Quedan pendientes los 3 .doc antiguos. La bitácora viaja en este mismo commit.

Co-Authored-By: Claude Sonnet 5.5 <noreply@anthropic.com>
</commit_message>
<xml_diff>
--- a/docs/formatos/inspecciones/INSP-05 Reconectadores.docx
+++ b/docs/formatos/inspecciones/INSP-05 Reconectadores.docx
@@ -106,7 +106,7 @@
           <w:u w:val="single"/>
           <w:lang w:val="es-CL"/>
         </w:rPr>
-        <w:t>EST-ELEC-MLP-STN-05</w:t>
+        <w:t>EST-ELEC-MLP-Bbosch-05</w:t>
       </w:r>
     </w:p>
     <w:p>
@@ -951,7 +951,7 @@
                 <w:sz w:val="20"/>
                 <w:szCs w:val="20"/>
               </w:rPr>
-              <w:t>Supervisor STN:</w:t>
+              <w:t>Supervisor Bbosch:</w:t>
             </w:r>
             <w:r>
               <w:t xml:space="preserve"> </w:t>
@@ -1060,7 +1060,7 @@
                 <w:sz w:val="20"/>
                 <w:szCs w:val="20"/>
               </w:rPr>
-              <w:t>Planificador STN:</w:t>
+              <w:t>Planificador Bbosch:</w:t>
             </w:r>
             <w:r>
               <w:t xml:space="preserve"> </w:t>

</xml_diff>